<commit_message>
Add advanced jersey operations platform features
</commit_message>
<xml_diff>
--- a/docs/word/01_Project_Overview_and_Feature_Map.docx
+++ b/docs/word/01_Project_Overview_and_Feature_Map.docx
@@ -57,7 +57,7 @@
           <w:sz w:val="22"/>
           <w:szCs w:val="22"/>
         </w:rPr>
-        <w:t xml:space="preserve">This platform is a multi-tenant sports retail operations system for shop owners, staff, and a platform Super Admin. It combines catalog management, POS, custom order production, customer records, reporting, tenant branding, and audit logging in one Next.js application.</w:t>
+        <w:t xml:space="preserve">This platform is a multi-tenant sports retail operations system for shop owners, staff, suppliers, customers, and a platform Super Admin. It combines catalog management, POS, credit sales, debts, custom jersey production, design studio tools, customer records, messaging, reporting, tenant branding, supplier purchasing, shop-to-shop networking, daily closing, exports, and audit logging in one Next.js application.</w:t>
       </w:r>
     </w:p>
     <w:p>
@@ -69,7 +69,7 @@
           <w:sz w:val="22"/>
           <w:szCs w:val="22"/>
         </w:rPr>
-        <w:t xml:space="preserve">The app is built as a launch-ready Phase 1 MVP with extension points for payments, SMS or WhatsApp, offline POS, rentals, supplier purchasing, accounting, and mobile apps.</w:t>
+        <w:t xml:space="preserve">The app is built as a launch-ready SaaS foundation with extension points for production Paystack webhooks, SMS or WhatsApp providers, deeper cutter-machine integrations, offline POS, rentals, accounting, and mobile apps.</w:t>
       </w:r>
     </w:p>
     <w:p>
@@ -204,6 +204,125 @@
           <w:szCs w:val="21"/>
         </w:rPr>
         <w:t xml:space="preserve">Reports: revenue, order count, average order, best sellers, stock report, staff performance, CSV export, and print-to-PDF.</w:t>
+      </w:r>
+    </w:p>
+    <w:p>
+      <w:pPr>
+        <w:pStyle w:val="ListParagraph"/>
+        <w:numPr>
+          <w:ilvl w:val="0"/>
+          <w:numId w:val="1"/>
+        </w:numPr>
+        <w:spacing w:after="100"/>
+      </w:pPr>
+      <w:r>
+        <w:rPr>
+          <w:sz w:val="21"/>
+          <w:szCs w:val="21"/>
+        </w:rPr>
+        <w:t xml:space="preserve">Debts: POS store-credit sales create customer debts and installment schedules automatically.</w:t>
+      </w:r>
+    </w:p>
+    <w:p>
+      <w:pPr>
+        <w:pStyle w:val="ListParagraph"/>
+        <w:numPr>
+          <w:ilvl w:val="0"/>
+          <w:numId w:val="1"/>
+        </w:numPr>
+        <w:spacing w:after="100"/>
+      </w:pPr>
+      <w:r>
+        <w:rPr>
+          <w:sz w:val="21"/>
+          <w:szCs w:val="21"/>
+        </w:rPr>
+        <w:t xml:space="preserve">Daily Closing: staff enter manual cash counts and compare them with system-expected cash, card, mobile money, and credit totals.</w:t>
+      </w:r>
+    </w:p>
+    <w:p>
+      <w:pPr>
+        <w:pStyle w:val="ListParagraph"/>
+        <w:numPr>
+          <w:ilvl w:val="0"/>
+          <w:numId w:val="1"/>
+        </w:numPr>
+        <w:spacing w:after="100"/>
+      </w:pPr>
+      <w:r>
+        <w:rPr>
+          <w:sz w:val="21"/>
+          <w:szCs w:val="21"/>
+        </w:rPr>
+        <w:t xml:space="preserve">Exports Center: POS, payment modes, debts, closing, catalog, suppliers, shop network, design jobs, messages, and activity logs export to PDF, Word, or Excel-compatible files.</w:t>
+      </w:r>
+    </w:p>
+    <w:p>
+      <w:pPr>
+        <w:pStyle w:val="ListParagraph"/>
+        <w:numPr>
+          <w:ilvl w:val="0"/>
+          <w:numId w:val="1"/>
+        </w:numPr>
+        <w:spacing w:after="100"/>
+      </w:pPr>
+      <w:r>
+        <w:rPr>
+          <w:sz w:val="21"/>
+          <w:szCs w:val="21"/>
+        </w:rPr>
+        <w:t xml:space="preserve">Design Studio: jersey artwork controls for garment style, layers, vinyl colors, heat press settings, cutter profiles, registration marks, weed boxes, mirrored HTV transfer mode, SVG export, JSON job export, and PLT cut-path export.</w:t>
+      </w:r>
+    </w:p>
+    <w:p>
+      <w:pPr>
+        <w:pStyle w:val="ListParagraph"/>
+        <w:numPr>
+          <w:ilvl w:val="0"/>
+          <w:numId w:val="1"/>
+        </w:numPr>
+        <w:spacing w:after="100"/>
+      </w:pPr>
+      <w:r>
+        <w:rPr>
+          <w:sz w:val="21"/>
+          <w:szCs w:val="21"/>
+        </w:rPr>
+        <w:t xml:space="preserve">Suppliers: supplier directory, supplier portal login, purchase orders, receiving workflow, stock increment on receipt, and lead-time tracking.</w:t>
+      </w:r>
+    </w:p>
+    <w:p>
+      <w:pPr>
+        <w:pStyle w:val="ListParagraph"/>
+        <w:numPr>
+          <w:ilvl w:val="0"/>
+          <w:numId w:val="1"/>
+        </w:numPr>
+        <w:spacing w:after="100"/>
+      </w:pPr>
+      <w:r>
+        <w:rPr>
+          <w:sz w:val="21"/>
+          <w:szCs w:val="21"/>
+        </w:rPr>
+        <w:t xml:space="preserve">Shop Network: each shop has a unique code for linking with trusted shops and requesting or exchanging stock.</w:t>
+      </w:r>
+    </w:p>
+    <w:p>
+      <w:pPr>
+        <w:pStyle w:val="ListParagraph"/>
+        <w:numPr>
+          <w:ilvl w:val="0"/>
+          <w:numId w:val="1"/>
+        </w:numPr>
+        <w:spacing w:after="100"/>
+      </w:pPr>
+      <w:r>
+        <w:rPr>
+          <w:sz w:val="21"/>
+          <w:szCs w:val="21"/>
+        </w:rPr>
+        <w:t xml:space="preserve">Payments: one platform Paystack secret can initialize transactions while each shop can store its own Paystack subaccount code and mobile money settlement details.</w:t>
       </w:r>
     </w:p>
     <w:p>

</xml_diff>